<commit_message>
Add multiplayer lobby and start game flow
</commit_message>
<xml_diff>
--- a/client/test case.docx
+++ b/client/test case.docx
@@ -808,33 +808,15 @@
           <w:sz w:val="32"/>
           <w:szCs w:val="32"/>
         </w:rPr>
-        <w:t xml:space="preserve">BOTTOM = Action buttons </w:t>
-      </w:r>
-      <w:proofErr w:type="gramStart"/>
-      <w:r>
-        <w:rPr>
-          <w:rFonts w:ascii="Times New Roman" w:hAnsi="Times New Roman" w:cs="Times New Roman"/>
-          <w:sz w:val="32"/>
-          <w:szCs w:val="32"/>
-        </w:rPr>
-        <w:t>only</w:t>
-      </w:r>
-      <w:r>
-        <w:rPr>
-          <w:rFonts w:ascii="Times New Roman" w:hAnsi="Times New Roman" w:cs="Times New Roman"/>
-          <w:sz w:val="32"/>
-          <w:szCs w:val="32"/>
-        </w:rPr>
-        <w:t>(</w:t>
-      </w:r>
-      <w:proofErr w:type="gramEnd"/>
-      <w:r>
-        <w:rPr>
-          <w:rFonts w:ascii="Times New Roman" w:hAnsi="Times New Roman" w:cs="Times New Roman"/>
-          <w:sz w:val="32"/>
-          <w:szCs w:val="32"/>
-        </w:rPr>
-        <w:t>thiz will change in the future)</w:t>
+        <w:t>BOTTOM = Action buttons only</w:t>
+      </w:r>
+      <w:r>
+        <w:rPr>
+          <w:rFonts w:ascii="Times New Roman" w:hAnsi="Times New Roman" w:cs="Times New Roman"/>
+          <w:sz w:val="32"/>
+          <w:szCs w:val="32"/>
+        </w:rPr>
+        <w:t>(thiz will change in the future)</w:t>
       </w:r>
     </w:p>
     <w:p>
@@ -1472,33 +1454,15 @@
           <w:sz w:val="32"/>
           <w:szCs w:val="32"/>
         </w:rPr>
-        <w:t xml:space="preserve">Khu của người chơi chỉ nên hiện của người chơi, vì thông tin của bot đã ở khu bên trái </w:t>
-      </w:r>
-      <w:proofErr w:type="gramStart"/>
-      <w:r>
-        <w:rPr>
-          <w:rFonts w:ascii="Times New Roman" w:hAnsi="Times New Roman" w:cs="Times New Roman"/>
-          <w:sz w:val="32"/>
-          <w:szCs w:val="32"/>
-        </w:rPr>
-        <w:t>rồi</w:t>
-      </w:r>
-      <w:r>
-        <w:rPr>
-          <w:rFonts w:ascii="Times New Roman" w:hAnsi="Times New Roman" w:cs="Times New Roman"/>
-          <w:sz w:val="32"/>
-          <w:szCs w:val="32"/>
-        </w:rPr>
-        <w:t>(</w:t>
-      </w:r>
-      <w:proofErr w:type="gramEnd"/>
-      <w:r>
-        <w:rPr>
-          <w:rFonts w:ascii="Times New Roman" w:hAnsi="Times New Roman" w:cs="Times New Roman"/>
-          <w:sz w:val="32"/>
-          <w:szCs w:val="32"/>
-        </w:rPr>
-        <w:t>tưởng cái này là tính năng nma trông bất tiện vl)</w:t>
+        <w:t>Khu của người chơi chỉ nên hiện của người chơi, vì thông tin của bot đã ở khu bên trái rồi</w:t>
+      </w:r>
+      <w:r>
+        <w:rPr>
+          <w:rFonts w:ascii="Times New Roman" w:hAnsi="Times New Roman" w:cs="Times New Roman"/>
+          <w:sz w:val="32"/>
+          <w:szCs w:val="32"/>
+        </w:rPr>
+        <w:t>(tưởng cái này là tính năng nma trông bất tiện vl)</w:t>
       </w:r>
     </w:p>
     <w:p>
@@ -1549,25 +1513,7 @@
           <w:sz w:val="32"/>
           <w:szCs w:val="32"/>
         </w:rPr>
-        <w:t xml:space="preserve">Đã fix bot để k </w:t>
-      </w:r>
-      <w:proofErr w:type="gramStart"/>
-      <w:r>
-        <w:rPr>
-          <w:rFonts w:ascii="Times New Roman" w:hAnsi="Times New Roman" w:cs="Times New Roman"/>
-          <w:sz w:val="32"/>
-          <w:szCs w:val="32"/>
-        </w:rPr>
-        <w:t>crash(</w:t>
-      </w:r>
-      <w:proofErr w:type="gramEnd"/>
-      <w:r>
-        <w:rPr>
-          <w:rFonts w:ascii="Times New Roman" w:hAnsi="Times New Roman" w:cs="Times New Roman"/>
-          <w:sz w:val="32"/>
-          <w:szCs w:val="32"/>
-        </w:rPr>
-        <w:t>thêm điều kiện skip turn/cho khôn hơn chút)</w:t>
+        <w:t>Đã fix bot để k crash(thêm điều kiện skip turn/cho khôn hơn chút)</w:t>
       </w:r>
     </w:p>
     <w:p>
@@ -1919,6 +1865,57 @@
           <w:szCs w:val="32"/>
         </w:rPr>
         <w:t>10. Chụp ảnh nếu có lỗi hoặc layout bị vỡ</w:t>
+      </w:r>
+    </w:p>
+    <w:p>
+      <w:pPr>
+        <w:rPr>
+          <w:rFonts w:ascii="Times New Roman" w:hAnsi="Times New Roman" w:cs="Times New Roman"/>
+          <w:sz w:val="32"/>
+          <w:szCs w:val="32"/>
+        </w:rPr>
+      </w:pPr>
+      <w:r>
+        <w:rPr>
+          <w:rFonts w:ascii="Times New Roman" w:hAnsi="Times New Roman" w:cs="Times New Roman"/>
+          <w:sz w:val="32"/>
+          <w:szCs w:val="32"/>
+        </w:rPr>
+        <w:t>Prob</w:t>
+      </w:r>
+    </w:p>
+    <w:p>
+      <w:pPr>
+        <w:rPr>
+          <w:rFonts w:ascii="Times New Roman" w:hAnsi="Times New Roman" w:cs="Times New Roman"/>
+          <w:sz w:val="32"/>
+          <w:szCs w:val="32"/>
+        </w:rPr>
+      </w:pPr>
+      <w:r>
+        <w:rPr>
+          <w:rFonts w:ascii="Times New Roman" w:hAnsi="Times New Roman" w:cs="Times New Roman"/>
+          <w:sz w:val="32"/>
+          <w:szCs w:val="32"/>
+        </w:rPr>
+        <w:t>Noble bi loi chi display 5 noble, k day noble moi len khi het noble</w:t>
+      </w:r>
+    </w:p>
+    <w:p>
+      <w:pPr>
+        <w:rPr>
+          <w:rFonts w:ascii="Times New Roman" w:hAnsi="Times New Roman" w:cs="Times New Roman"/>
+          <w:sz w:val="32"/>
+          <w:szCs w:val="32"/>
+        </w:rPr>
+      </w:pPr>
+      <w:r>
+        <w:rPr>
+          <w:rFonts w:ascii="Times New Roman" w:hAnsi="Times New Roman" w:cs="Times New Roman"/>
+          <w:sz w:val="32"/>
+          <w:szCs w:val="32"/>
+        </w:rPr>
+        <w:t>Nen glow mau nhan nhat cho nhung chip/the co the mua duoc</w:t>
       </w:r>
     </w:p>
     <w:p>

</xml_diff>

<commit_message>
Add synced reserve card action
</commit_message>
<xml_diff>
--- a/client/test case.docx
+++ b/client/test case.docx
@@ -1916,6 +1916,74 @@
           <w:szCs w:val="32"/>
         </w:rPr>
         <w:t>Nen glow mau nhan nhat cho nhung chip/the co the mua duoc</w:t>
+      </w:r>
+    </w:p>
+    <w:p>
+      <w:pPr>
+        <w:rPr>
+          <w:rFonts w:ascii="Times New Roman" w:hAnsi="Times New Roman" w:cs="Times New Roman"/>
+          <w:sz w:val="32"/>
+          <w:szCs w:val="32"/>
+        </w:rPr>
+      </w:pPr>
+      <w:r>
+        <w:rPr>
+          <w:rFonts w:ascii="Times New Roman" w:hAnsi="Times New Roman" w:cs="Times New Roman"/>
+          <w:sz w:val="32"/>
+          <w:szCs w:val="32"/>
+        </w:rPr>
+        <w:t>multiplayer</w:t>
+      </w:r>
+    </w:p>
+    <w:p>
+      <w:pPr>
+        <w:rPr>
+          <w:rFonts w:ascii="Times New Roman" w:hAnsi="Times New Roman" w:cs="Times New Roman"/>
+          <w:sz w:val="32"/>
+          <w:szCs w:val="32"/>
+        </w:rPr>
+      </w:pPr>
+      <w:r>
+        <w:rPr>
+          <w:rFonts w:ascii="Times New Roman" w:hAnsi="Times New Roman" w:cs="Times New Roman"/>
+          <w:sz w:val="32"/>
+          <w:szCs w:val="32"/>
+        </w:rPr>
+        <w:t>Day 1: Lobby + Start Game — DONE</w:t>
+      </w:r>
+    </w:p>
+    <w:p>
+      <w:pPr>
+        <w:rPr>
+          <w:rFonts w:ascii="Times New Roman" w:hAnsi="Times New Roman" w:cs="Times New Roman"/>
+          <w:sz w:val="32"/>
+          <w:szCs w:val="32"/>
+        </w:rPr>
+      </w:pPr>
+      <w:r>
+        <w:rPr>
+          <w:rFonts w:ascii="Times New Roman" w:hAnsi="Times New Roman" w:cs="Times New Roman"/>
+          <w:sz w:val="32"/>
+          <w:szCs w:val="32"/>
+        </w:rPr>
+        <w:t>Day 2: Initial GameState Sync — DONE</w:t>
+      </w:r>
+    </w:p>
+    <w:p>
+      <w:pPr>
+        <w:rPr>
+          <w:rFonts w:ascii="Times New Roman" w:hAnsi="Times New Roman" w:cs="Times New Roman"/>
+          <w:sz w:val="32"/>
+          <w:szCs w:val="32"/>
+        </w:rPr>
+      </w:pPr>
+      <w:r>
+        <w:rPr>
+          <w:rFonts w:ascii="Times New Roman" w:hAnsi="Times New Roman" w:cs="Times New Roman"/>
+          <w:sz w:val="32"/>
+          <w:szCs w:val="32"/>
+        </w:rPr>
+        <w:t>Day 3: Take Chips Sync — DONE</w:t>
       </w:r>
     </w:p>
     <w:p>

</xml_diff>